<commit_message>
Apply proof corrections: stale provenance wording, section order, keywords
Pre-submission proof (CARS-D-26-01547) review found four internal
inconsistencies introduced by the real-data additions:
- three leftover "archive was not downloaded" sentences (Methods,
  Results provenance, Discussion) now correctly distinguish the
  synthetic/fixture scope from the downloaded recorded series;
- the Real-data protocol/results sections had drifted after the
  Export/privacy heading (insertion artifact) — reordered so each
  heading directly precedes its own paragraph;
- Title Page keywords: "runtime profiling" -> "real-data evaluation"
  to match the submitted keyword list;
- cover letter: double "and" in the outcomes enumeration.

Synced to repo and desktop submission copies; manifest regenerated.

Generated with Codebuff 🤖
Co-Authored-By: Codebuff <noreply@codebuff.com>
</commit_message>
<xml_diff>
--- a/verification/publication_package/01_Manuscript/Blinded Manuscript.docx
+++ b/verification/publication_package/01_Manuscript/Blinded Manuscript.docx
@@ -122,7 +122,7 @@
     </w:p>
     <w:p>
       <w:r>
-        <w:t>The full archive was not downloaded in the present environment. The provenance statement is therefore limited to metadata-level legal and dataset provenance, not to a downloaded public imaging archive benchmark.</w:t>
+        <w:t>The full collection archive was not downloaded in the present environment; however, the exact recorded series was subsequently downloaded in full via the NBIA API and evaluated on real image data (see Real-data evaluation protocol below). Provenance for the synthetic and fixture benchmarks is therefore limited to metadata-level legal and dataset provenance.</w:t>
       </w:r>
     </w:p>
     <w:p>
@@ -239,6 +239,11 @@
       </w:r>
     </w:p>
     <w:p>
+      <w:r>
+        <w:t>The export/privacy benchmark used generated valid and invalid archive fixtures with explicit labels. Valid archives represented compliant exports; invalid archives included path leakage, unsafe members, non-pseudonymous DICOM metadata, or legacy angle semantics. Ground truth was defined by the fixture specification. Sensitivity and specificity were computed from the binary classification of each fixture.</w:t>
+      </w:r>
+    </w:p>
+    <w:p>
       <w:pPr>
         <w:pStyle w:val="Heading3"/>
       </w:pPr>
@@ -252,11 +257,6 @@
       </w:pPr>
       <w:r>
         <w:t>The exact series recorded in the provenance statement was downloaded in full via the NBIA API (44,282,129 bytes; ZIP SHA-256 fe6d292dc6989ca85d8323781067a3781ddc21c62105403ee83af512725539ea) and loaded through the application's own series-loading path: 172 CT slices, 512 x 512, spacing 0.68359375 x 0.68359375 x 2.0 mm, rescale slope 1 / intercept -1024. Three real-data checks were run: (1) CT-number accuracy on the phantom's air regions (pixels &lt;= -950 HU compared with the -1000 HU reference, tolerance +/-30 HU); (2) first-order radiomics on a centered 24 mm-radius cylindrical ROI on the middle axial slice (3,884 voxels), comparing the application's engine with PyRadiomics v3.0.1 at binWidth 25.0 and voxelArrayShift 0.0, tolerance 1e-6 (the comparator reports StandardDeviation as the square root of its Variance output, which the comparison documents); and (3) an export/privacy round trip in which the real middle slice was de-identified by the application, packaged by its export path, and checked by its validation gate, including rejection of an archive whose manifest hash was corrupted before re-compression.</w:t>
-      </w:r>
-    </w:p>
-    <w:p>
-      <w:r>
-        <w:t>The export/privacy benchmark used generated valid and invalid archive fixtures with explicit labels. Valid archives represented compliant exports; invalid archives included path leakage, unsafe members, non-pseudonymous DICOM metadata, or legacy angle semantics. Ground truth was defined by the fixture specification. Sensitivity and specificity were computed from the binary classification of each fixture.</w:t>
       </w:r>
     </w:p>
     <w:p>
@@ -290,7 +290,7 @@
     </w:p>
     <w:p>
       <w:r>
-        <w:t>The public dataset was identified and recorded with exact identifiers and legal metadata. This record is legally traceable and suitable for public-data provenance reporting. However, because the archive itself was not downloaded, no patient-level image benchmarking or full public archive analysis was performed.</w:t>
+        <w:t>The public dataset was identified and recorded with exact identifiers and legal metadata. This record is legally traceable and suitable for public-data provenance reporting. However, no patient-level image benchmarking or full public archive analysis was performed: the real-data evaluation covers the single recorded series (see below), and the remainder of the collection was not downloaded.</w:t>
       </w:r>
     </w:p>
     <w:p>
@@ -452,6 +452,11 @@
       </w:r>
     </w:p>
     <w:p>
+      <w:r>
+        <w:t>The challenge set contained 20 valid and 20 invalid archives. Results were:</w:t>
+      </w:r>
+    </w:p>
+    <w:p>
       <w:pPr>
         <w:pStyle w:val="Heading3"/>
       </w:pPr>
@@ -465,11 +470,6 @@
       </w:pPr>
       <w:r>
         <w:t>On the downloaded real series, the air-region CT-number check measured a mean of -993.77 HU over 122,563 air pixels (absolute deviation 6.23 HU from the -1000 HU reference, within the +/-30 HU tolerance); the soft-tissue-equivalent inserts measured 33.3 HU mean. On the real 3,884-voxel ROI, the application's engine measured mean = 58.674047 HU, std = 36.666334 HU, min = -95 HU, max = 157 HU, and PyRadiomics v3.0.1 produced identical values with all absolute errors 0.0 at the declared 1e-6 tolerance. The de-identified real slice carried PatientName = ANONYMOUS, PatientID = ANONYMOUS, PatientIdentityRemoved = YES; its export archive passed the validation gate, and a rebuilt archive with one corrupted manifest hash was rejected. The full-series statistical study extended these checks to every slice of the downloaded series: first-order agreement with PyRadiomics v3.0.1 held on 172/172 slice ROIs with a maximum absolute error of 0.0 at the 1e-6 tolerance; agreement was unchanged across ROI radii of 12, 18, 24, 30, and 36 mm; the air-region calibration stayed within the +/-30 HU band on every slice (worst-slice deviation 14.39 HU); and the export/privacy round trip succeeded for all 172 de-identified slices, with 11/11 deterministically sampled manifest-corruption probes rejected. A data-driven decomposition of the recorded IBSI morphology disagreements shows systematic signed deviations by feature kind (volumes -3.34% to -3.23%; surface area +8.31%; surface-derived ratios -9.71% to +12.00%; PCA eigenvalues -2.83% to +0.45%), while PyRadiomics' two internal volume definitions agree to within 0.09% on a smooth real 3D ROI - supporting convention-related reference segmentation/grid differences rather than a computational defect. These measurements establish agreement on real image data for the compared statistics on this series; they do not extend to other series, lesions, or patient cohorts, and the morphology findings quantify - but do not fully reconcile - the reference convention gap.</w:t>
-      </w:r>
-    </w:p>
-    <w:p>
-      <w:r>
-        <w:t>The challenge set contained 20 valid and 20 invalid archives. Results were:</w:t>
       </w:r>
     </w:p>
     <w:p>
@@ -638,7 +638,7 @@
     </w:p>
     <w:p>
       <w:r>
-        <w:t>The scope boundaries remain critical. The PyRadiomics agreement is matched and first-order only; the IBSI verification is specific to Configuration D on the CT radiomics phantom; and the public archive was not downloaded. None of these results supports a claim of patient-level generalization, diagnostic performance, full IBSI certification, or superiority over any external benchmark.</w:t>
+        <w:t>The scope boundaries remain critical. The PyRadiomics agreement is matched and first-order only; the IBSI verification is specific to Configuration D on the CT radiomics phantom; the real-data evaluation covers the single recorded phantom series; and the remainder of the public archive was not downloaded. None of these results supports a claim of patient-level generalization, diagnostic performance, full IBSI certification, or superiority over any external benchmark.</w:t>
       </w:r>
     </w:p>
     <w:p>

</xml_diff>